<commit_message>
Add Week 4 machine learning evaluation report and results
</commit_message>
<xml_diff>
--- a/Week4-Machine-Learning-Model-Development/Week4_Machine_Learning_Model_Development_Report.docx
+++ b/Week4-Machine-Learning-Model-Development/Week4_Machine_Learning_Model_Development_Report.docx
@@ -42,7 +42,7 @@
     </w:p>
     <w:p>
       <w:r>
-        <w:t>This project trains classification models to estimate whether a student reaches the report's descriptive threshold of G3 &gt;= 10/20, using background and study-related variables while deliberately excluding G1 and G2 from the predictors to reduce target leakage. The dataset contains 395 eligible records; 67.1% meet the threshold. Four candidate models were compared by stratified five-fold cross-validation on the training split. The selected model was Logistic regression, with mean cross-validation ROC-AUC 0.689. On the held-out test set, accuracy was 0.595, balanced accuracy 0.561, F1 0.686, and ROC-AUC 0.595. These metrics are educational evidence, not a validated high-stakes prediction system.</w:t>
+        <w:t>This project trains classification models to estimate whether a student reaches the report's descriptive threshold of G3 &gt;= 10/20, using background and study-related variables while deliberately excluding G1 and G2 from the predictors to reduce target leakage. The dataset contains 395 eligible records; 67.1% meet the threshold. Four candidate models were compared by stratified five-fold cross-validation on the training split. The selected model was Logistic regression, with mean cross-validation ROC-AUC 0.689. On the held-out test set, accuracy was 0.595, balanced accuracy 0.561, F1 0.686, and ROC-AUC 0.595. The test ROC-AUC is only modestly above chance, so the model has limited discrimination on this held-out sample. These metrics are educational evidence, not a validated high-stakes prediction system.</w:t>
       </w:r>
     </w:p>
     <w:p>
@@ -829,6 +829,11 @@
       </w:r>
     </w:p>
     <w:p>
+      <w:r>
+        <w:br w:type="page"/>
+      </w:r>
+    </w:p>
+    <w:p>
       <w:pPr>
         <w:pStyle w:val="Heading1"/>
       </w:pPr>
@@ -889,6 +894,11 @@
       </w:r>
     </w:p>
     <w:p>
+      <w:r>
+        <w:br w:type="page"/>
+      </w:r>
+    </w:p>
+    <w:p>
       <w:pPr>
         <w:pStyle w:val="Heading2"/>
       </w:pPr>
@@ -938,6 +948,11 @@
     <w:p>
       <w:r>
         <w:t>Shows true negatives, false positives, false negatives, and true positives on held-out test cases. False negatives may mean an at-risk student is missed; false positives may cause unnecessary follow-up.</w:t>
+      </w:r>
+    </w:p>
+    <w:p>
+      <w:r>
+        <w:br w:type="page"/>
       </w:r>
     </w:p>
     <w:p>
@@ -993,6 +1008,11 @@
       </w:r>
     </w:p>
     <w:p>
+      <w:r>
+        <w:br w:type="page"/>
+      </w:r>
+    </w:p>
+    <w:p>
       <w:pPr>
         <w:pStyle w:val="Heading2"/>
       </w:pPr>
@@ -1042,6 +1062,11 @@
     <w:p>
       <w:r>
         <w:t>Presents complementary metrics on the same 0–1 scale; gaps between precision and recall can reveal different kinds of model error.</w:t>
+      </w:r>
+    </w:p>
+    <w:p>
+      <w:r>
+        <w:br w:type="page"/>
       </w:r>
     </w:p>
     <w:p>

</xml_diff>